<commit_message>
docs: add system design documentation, diagrams, and project presentation assets
</commit_message>
<xml_diff>
--- a/Docs/30 Percent/SDD.docx
+++ b/Docs/30 Percent/SDD.docx
@@ -6875,8 +6875,8 @@
           <w:noProof/>
         </w:rPr>
         <w:drawing>
-          <wp:inline distT="0" distB="0" distL="0" distR="0" wp14:anchorId="403D45DF" wp14:editId="657309F8">
-            <wp:extent cx="5943600" cy="4241800"/>
+          <wp:inline distT="0" distB="0" distL="0" distR="0" wp14:anchorId="403D45DF" wp14:editId="5D0462BF">
+            <wp:extent cx="5939125" cy="4241800"/>
             <wp:effectExtent l="0" t="0" r="0" b="0"/>
             <wp:docPr id="1167249592" name="Picture 5"/>
             <wp:cNvGraphicFramePr>
@@ -6886,7 +6886,7 @@
               <a:graphicData uri="http://schemas.openxmlformats.org/drawingml/2006/picture">
                 <pic:pic xmlns:pic="http://schemas.openxmlformats.org/drawingml/2006/picture">
                   <pic:nvPicPr>
-                    <pic:cNvPr id="1167249592" name="Picture 1167249592"/>
+                    <pic:cNvPr id="1167249592" name="Picture 5"/>
                     <pic:cNvPicPr/>
                   </pic:nvPicPr>
                   <pic:blipFill>
@@ -6904,7 +6904,7 @@
                   <pic:spPr>
                     <a:xfrm>
                       <a:off x="0" y="0"/>
-                      <a:ext cx="5943600" cy="4241800"/>
+                      <a:ext cx="5939125" cy="4241800"/>
                     </a:xfrm>
                     <a:prstGeom prst="rect">
                       <a:avLst/>
@@ -7617,8 +7617,8 @@
           <w:noProof/>
         </w:rPr>
         <w:drawing>
-          <wp:inline distT="0" distB="0" distL="0" distR="0" wp14:anchorId="2E70DF8C" wp14:editId="76FAEED5">
-            <wp:extent cx="5943600" cy="5768340"/>
+          <wp:inline distT="0" distB="0" distL="0" distR="0" wp14:anchorId="2E70DF8C" wp14:editId="6708F0A2">
+            <wp:extent cx="5943600" cy="5766211"/>
             <wp:effectExtent l="0" t="0" r="0" b="0"/>
             <wp:docPr id="1874209109" name="Picture 8"/>
             <wp:cNvGraphicFramePr>
@@ -7628,7 +7628,7 @@
               <a:graphicData uri="http://schemas.openxmlformats.org/drawingml/2006/picture">
                 <pic:pic xmlns:pic="http://schemas.openxmlformats.org/drawingml/2006/picture">
                   <pic:nvPicPr>
-                    <pic:cNvPr id="1874209109" name="Picture 1874209109"/>
+                    <pic:cNvPr id="1874209109" name="Picture 8"/>
                     <pic:cNvPicPr/>
                   </pic:nvPicPr>
                   <pic:blipFill>
@@ -7646,7 +7646,7 @@
                   <pic:spPr>
                     <a:xfrm>
                       <a:off x="0" y="0"/>
-                      <a:ext cx="5943600" cy="5768340"/>
+                      <a:ext cx="5943600" cy="5766211"/>
                     </a:xfrm>
                     <a:prstGeom prst="rect">
                       <a:avLst/>
@@ -22366,7 +22366,7 @@
           <w:noProof/>
         </w:rPr>
         <w:drawing>
-          <wp:anchor distT="0" distB="0" distL="114300" distR="114300" simplePos="0" relativeHeight="251668992" behindDoc="0" locked="0" layoutInCell="1" allowOverlap="1" wp14:anchorId="7CF738FE" wp14:editId="1E10BD0E">
+          <wp:anchor distT="0" distB="0" distL="114300" distR="114300" simplePos="0" relativeHeight="251668992" behindDoc="0" locked="0" layoutInCell="1" allowOverlap="1" wp14:anchorId="7CF738FE" wp14:editId="44B17601">
             <wp:simplePos x="0" y="0"/>
             <wp:positionH relativeFrom="column">
               <wp:posOffset>3378835</wp:posOffset>
@@ -22564,7 +22564,7 @@
           <w:noProof/>
         </w:rPr>
         <w:drawing>
-          <wp:anchor distT="0" distB="0" distL="114300" distR="114300" simplePos="0" relativeHeight="251625984" behindDoc="0" locked="0" layoutInCell="1" allowOverlap="1" wp14:anchorId="4DB29630" wp14:editId="2E8777EE">
+          <wp:anchor distT="0" distB="0" distL="114300" distR="114300" simplePos="0" relativeHeight="251625984" behindDoc="0" locked="0" layoutInCell="1" allowOverlap="1" wp14:anchorId="4DB29630" wp14:editId="176CD198">
             <wp:simplePos x="0" y="0"/>
             <wp:positionH relativeFrom="column">
               <wp:posOffset>198755</wp:posOffset>
@@ -22762,7 +22762,7 @@
           <w:noProof/>
         </w:rPr>
         <w:drawing>
-          <wp:anchor distT="0" distB="0" distL="114300" distR="114300" simplePos="0" relativeHeight="251718144" behindDoc="0" locked="0" layoutInCell="1" allowOverlap="1" wp14:anchorId="1BB9F0EC" wp14:editId="76DBA35F">
+          <wp:anchor distT="0" distB="0" distL="114300" distR="114300" simplePos="0" relativeHeight="251718144" behindDoc="0" locked="0" layoutInCell="1" allowOverlap="1" wp14:anchorId="1BB9F0EC" wp14:editId="159F32CE">
             <wp:simplePos x="0" y="0"/>
             <wp:positionH relativeFrom="column">
               <wp:posOffset>3378835</wp:posOffset>
@@ -22960,7 +22960,7 @@
           <w:noProof/>
         </w:rPr>
         <w:drawing>
-          <wp:anchor distT="0" distB="0" distL="114300" distR="114300" simplePos="0" relativeHeight="251688448" behindDoc="0" locked="0" layoutInCell="1" allowOverlap="1" wp14:anchorId="05F64AA9" wp14:editId="6182A8D4">
+          <wp:anchor distT="0" distB="0" distL="114300" distR="114300" simplePos="0" relativeHeight="251688448" behindDoc="0" locked="0" layoutInCell="1" allowOverlap="1" wp14:anchorId="05F64AA9" wp14:editId="6F4A6F5D">
             <wp:simplePos x="0" y="0"/>
             <wp:positionH relativeFrom="column">
               <wp:posOffset>150495</wp:posOffset>
@@ -26894,6 +26894,7 @@
   <w:style w:type="character" w:default="1" w:styleId="DefaultParagraphFont">
     <w:name w:val="Default Paragraph Font"/>
     <w:uiPriority w:val="1"/>
+    <w:semiHidden/>
     <w:unhideWhenUsed/>
   </w:style>
   <w:style w:type="table" w:default="1" w:styleId="TableNormal">

</xml_diff>